<commit_message>
Corrige captura de evidencia de compilacion
</commit_message>
<xml_diff>
--- a/Evidencia_Cajero_JaimeMonzon.docx
+++ b/Evidencia_Cajero_JaimeMonzon.docx
@@ -444,25 +444,99 @@
     </w:p>
     <w:p>
       <w:pPr>
-        <w:pBdr>
-          <w:top w:color="999999" w:space="0" w:sz="4" w:val="dashed"/>
-          <w:left w:color="999999" w:space="0" w:sz="4" w:val="dashed"/>
-          <w:bottom w:color="999999" w:space="0" w:sz="4" w:val="dashed"/>
-          <w:right w:color="999999" w:space="0" w:sz="4" w:val="dashed"/>
-        </w:pBdr>
-        <w:shd w:fill="f2f2f2" w:val="clear"/>
-        <w:spacing w:after="300" w:before="150" w:lineRule="auto"/>
-        <w:rPr/>
-      </w:pPr>
-      <w:r>
-        <w:rPr>
-          <w:i w:val="1"/>
-          <w:iCs w:val="1"/>
-          <w:color w:val="555555"/>
-          <w:rtl w:val="0"/>
-        </w:rPr>
-        <w:t xml:space="preserve">[ INSERTAR CAPTURA: Proyecto abierto en IntelliJ + consola mostrando el inicio del programa (solicitud de PIN) sin errores ]</w:t>
-      </w:r>
+        <w:spacing w:after="150" w:lineRule="auto"/>
+        <w:rPr/>
+      </w:pPr>
+      <w:r>
+        <w:rPr/>
+        <w:drawing>
+          <wp:inline distB="114300" distT="114300" distL="114300" distR="114300">
+            <wp:extent cx="5943600" cy="3340100"/>
+            <wp:effectExtent b="0" l="0" r="0" t="0"/>
+            <wp:docPr id="13" name="image4.png"/>
+            <a:graphic>
+              <a:graphicData uri="http://schemas.openxmlformats.org/drawingml/2006/picture">
+                <pic:pic>
+                  <pic:nvPicPr>
+                    <pic:cNvPr id="0" name="image4.png"/>
+                    <pic:cNvPicPr preferRelativeResize="0"/>
+                  </pic:nvPicPr>
+                  <pic:blipFill>
+                    <a:blip r:embed="rId7"/>
+                    <a:srcRect b="0" l="0" r="0" t="0"/>
+                    <a:stretch>
+                      <a:fillRect/>
+                    </a:stretch>
+                  </pic:blipFill>
+                  <pic:spPr>
+                    <a:xfrm>
+                      <a:off x="0" y="0"/>
+                      <a:ext cx="5943600" cy="3340100"/>
+                    </a:xfrm>
+                    <a:prstGeom prst="rect"/>
+                    <a:ln/>
+                  </pic:spPr>
+                </pic:pic>
+              </a:graphicData>
+            </a:graphic>
+          </wp:inline>
+        </w:drawing>
+      </w:r>
+      <w:r>
+        <w:rPr>
+          <w:rtl w:val="0"/>
+        </w:rPr>
+      </w:r>
+    </w:p>
+    <w:p>
+      <w:pPr>
+        <w:spacing w:after="150" w:lineRule="auto"/>
+        <w:rPr/>
+      </w:pPr>
+      <w:r>
+        <w:rPr>
+          <w:rtl w:val="0"/>
+        </w:rPr>
+      </w:r>
+    </w:p>
+    <w:p>
+      <w:pPr>
+        <w:spacing w:after="150" w:lineRule="auto"/>
+        <w:rPr/>
+      </w:pPr>
+      <w:r>
+        <w:rPr>
+          <w:rtl w:val="0"/>
+        </w:rPr>
+      </w:r>
+    </w:p>
+    <w:p>
+      <w:pPr>
+        <w:spacing w:after="150" w:lineRule="auto"/>
+        <w:rPr/>
+      </w:pPr>
+      <w:r>
+        <w:rPr>
+          <w:rtl w:val="0"/>
+        </w:rPr>
+      </w:r>
+    </w:p>
+    <w:p>
+      <w:pPr>
+        <w:spacing w:after="150" w:lineRule="auto"/>
+        <w:rPr/>
+      </w:pPr>
+      <w:r>
+        <w:rPr>
+          <w:rtl w:val="0"/>
+        </w:rPr>
+      </w:r>
+    </w:p>
+    <w:p>
+      <w:pPr>
+        <w:spacing w:after="150" w:lineRule="auto"/>
+        <w:rPr/>
+      </w:pPr>
       <w:r>
         <w:rPr>
           <w:rtl w:val="0"/>
@@ -537,7 +611,7 @@
                     <pic:cNvPicPr preferRelativeResize="0"/>
                   </pic:nvPicPr>
                   <pic:blipFill>
-                    <a:blip r:embed="rId7"/>
+                    <a:blip r:embed="rId8"/>
                     <a:srcRect b="0" l="0" r="0" t="0"/>
                     <a:stretch>
                       <a:fillRect/>
@@ -574,16 +648,16 @@
           <wp:inline distB="114300" distT="114300" distL="114300" distR="114300">
             <wp:extent cx="5362575" cy="5924550"/>
             <wp:effectExtent b="0" l="0" r="0" t="0"/>
-            <wp:docPr id="12" name="image4.png"/>
+            <wp:docPr id="12" name="image10.png"/>
             <a:graphic>
               <a:graphicData uri="http://schemas.openxmlformats.org/drawingml/2006/picture">
                 <pic:pic>
                   <pic:nvPicPr>
-                    <pic:cNvPr id="0" name="image4.png"/>
+                    <pic:cNvPr id="0" name="image10.png"/>
                     <pic:cNvPicPr preferRelativeResize="0"/>
                   </pic:nvPicPr>
                   <pic:blipFill>
-                    <a:blip r:embed="rId8"/>
+                    <a:blip r:embed="rId9"/>
                     <a:srcRect b="0" l="0" r="0" t="0"/>
                     <a:stretch>
                       <a:fillRect/>
@@ -613,6 +687,54 @@
       <w:pPr>
         <w:pStyle w:val="Heading2"/>
         <w:spacing w:after="150" w:before="300" w:lineRule="auto"/>
+        <w:rPr>
+          <w:b w:val="1"/>
+          <w:bCs w:val="1"/>
+          <w:color w:val="1f4e79"/>
+        </w:rPr>
+      </w:pPr>
+      <w:r>
+        <w:rPr>
+          <w:rtl w:val="0"/>
+        </w:rPr>
+      </w:r>
+    </w:p>
+    <w:p>
+      <w:pPr>
+        <w:pStyle w:val="Heading2"/>
+        <w:spacing w:after="150" w:before="300" w:lineRule="auto"/>
+        <w:rPr>
+          <w:b w:val="1"/>
+          <w:bCs w:val="1"/>
+          <w:color w:val="1f4e79"/>
+        </w:rPr>
+      </w:pPr>
+      <w:r>
+        <w:rPr>
+          <w:rtl w:val="0"/>
+        </w:rPr>
+      </w:r>
+    </w:p>
+    <w:p>
+      <w:pPr>
+        <w:pStyle w:val="Heading2"/>
+        <w:spacing w:after="150" w:before="300" w:lineRule="auto"/>
+        <w:rPr>
+          <w:b w:val="1"/>
+          <w:bCs w:val="1"/>
+          <w:color w:val="1f4e79"/>
+        </w:rPr>
+      </w:pPr>
+      <w:r>
+        <w:rPr>
+          <w:rtl w:val="0"/>
+        </w:rPr>
+      </w:r>
+    </w:p>
+    <w:p>
+      <w:pPr>
+        <w:pStyle w:val="Heading2"/>
+        <w:spacing w:after="150" w:before="300" w:lineRule="auto"/>
         <w:rPr/>
       </w:pPr>
       <w:r>
@@ -653,16 +775,16 @@
           <wp:inline distB="114300" distT="114300" distL="114300" distR="114300">
             <wp:extent cx="4994275" cy="3289498"/>
             <wp:effectExtent b="0" l="0" r="0" t="0"/>
-            <wp:docPr id="10" name="image1.png"/>
+            <wp:docPr id="10" name="image5.png"/>
             <a:graphic>
               <a:graphicData uri="http://schemas.openxmlformats.org/drawingml/2006/picture">
                 <pic:pic>
                   <pic:nvPicPr>
-                    <pic:cNvPr id="0" name="image1.png"/>
+                    <pic:cNvPr id="0" name="image5.png"/>
                     <pic:cNvPicPr preferRelativeResize="0"/>
                   </pic:nvPicPr>
                   <pic:blipFill>
-                    <a:blip r:embed="rId9"/>
+                    <a:blip r:embed="rId10"/>
                     <a:srcRect b="0" l="0" r="0" t="0"/>
                     <a:stretch>
                       <a:fillRect/>
@@ -699,16 +821,16 @@
           <wp:inline distB="114300" distT="114300" distL="114300" distR="114300">
             <wp:extent cx="3616282" cy="5362575"/>
             <wp:effectExtent b="0" l="0" r="0" t="0"/>
-            <wp:docPr id="1" name="image6.png"/>
+            <wp:docPr id="1" name="image12.png"/>
             <a:graphic>
               <a:graphicData uri="http://schemas.openxmlformats.org/drawingml/2006/picture">
                 <pic:pic>
                   <pic:nvPicPr>
-                    <pic:cNvPr id="0" name="image6.png"/>
+                    <pic:cNvPr id="0" name="image12.png"/>
                     <pic:cNvPicPr preferRelativeResize="0"/>
                   </pic:nvPicPr>
                   <pic:blipFill>
-                    <a:blip r:embed="rId10"/>
+                    <a:blip r:embed="rId11"/>
                     <a:srcRect b="0" l="0" r="0" t="0"/>
                     <a:stretch>
                       <a:fillRect/>
@@ -738,6 +860,86 @@
       <w:pPr>
         <w:pStyle w:val="Heading2"/>
         <w:spacing w:after="150" w:before="300" w:lineRule="auto"/>
+        <w:rPr>
+          <w:b w:val="1"/>
+          <w:bCs w:val="1"/>
+          <w:color w:val="1f4e79"/>
+        </w:rPr>
+      </w:pPr>
+      <w:r>
+        <w:rPr>
+          <w:rtl w:val="0"/>
+        </w:rPr>
+      </w:r>
+    </w:p>
+    <w:p>
+      <w:pPr>
+        <w:pStyle w:val="Heading2"/>
+        <w:spacing w:after="150" w:before="300" w:lineRule="auto"/>
+        <w:rPr>
+          <w:b w:val="1"/>
+          <w:bCs w:val="1"/>
+          <w:color w:val="1f4e79"/>
+        </w:rPr>
+      </w:pPr>
+      <w:r>
+        <w:rPr>
+          <w:rtl w:val="0"/>
+        </w:rPr>
+      </w:r>
+    </w:p>
+    <w:p>
+      <w:pPr>
+        <w:pStyle w:val="Heading2"/>
+        <w:spacing w:after="150" w:before="300" w:lineRule="auto"/>
+        <w:rPr>
+          <w:b w:val="1"/>
+          <w:bCs w:val="1"/>
+          <w:color w:val="1f4e79"/>
+        </w:rPr>
+      </w:pPr>
+      <w:r>
+        <w:rPr>
+          <w:rtl w:val="0"/>
+        </w:rPr>
+      </w:r>
+    </w:p>
+    <w:p>
+      <w:pPr>
+        <w:pStyle w:val="Heading2"/>
+        <w:spacing w:after="150" w:before="300" w:lineRule="auto"/>
+        <w:rPr>
+          <w:b w:val="1"/>
+          <w:bCs w:val="1"/>
+          <w:color w:val="1f4e79"/>
+        </w:rPr>
+      </w:pPr>
+      <w:r>
+        <w:rPr>
+          <w:rtl w:val="0"/>
+        </w:rPr>
+      </w:r>
+    </w:p>
+    <w:p>
+      <w:pPr>
+        <w:pStyle w:val="Heading2"/>
+        <w:spacing w:after="150" w:before="300" w:lineRule="auto"/>
+        <w:rPr>
+          <w:b w:val="1"/>
+          <w:bCs w:val="1"/>
+          <w:color w:val="1f4e79"/>
+        </w:rPr>
+      </w:pPr>
+      <w:r>
+        <w:rPr>
+          <w:rtl w:val="0"/>
+        </w:rPr>
+      </w:r>
+    </w:p>
+    <w:p>
+      <w:pPr>
+        <w:pStyle w:val="Heading2"/>
+        <w:spacing w:after="150" w:before="300" w:lineRule="auto"/>
         <w:rPr/>
       </w:pPr>
       <w:r>
@@ -778,16 +980,16 @@
           <wp:inline distB="114300" distT="114300" distL="114300" distR="114300">
             <wp:extent cx="4514850" cy="5029200"/>
             <wp:effectExtent b="0" l="0" r="0" t="0"/>
-            <wp:docPr id="8" name="image2.png"/>
+            <wp:docPr id="8" name="image9.png"/>
             <a:graphic>
               <a:graphicData uri="http://schemas.openxmlformats.org/drawingml/2006/picture">
                 <pic:pic>
                   <pic:nvPicPr>
-                    <pic:cNvPr id="0" name="image2.png"/>
+                    <pic:cNvPr id="0" name="image9.png"/>
                     <pic:cNvPicPr preferRelativeResize="0"/>
                   </pic:nvPicPr>
                   <pic:blipFill>
-                    <a:blip r:embed="rId11"/>
+                    <a:blip r:embed="rId12"/>
                     <a:srcRect b="0" l="0" r="0" t="0"/>
                     <a:stretch>
                       <a:fillRect/>
@@ -817,6 +1019,102 @@
       <w:pPr>
         <w:pStyle w:val="Heading2"/>
         <w:spacing w:after="150" w:before="300" w:lineRule="auto"/>
+        <w:rPr>
+          <w:b w:val="1"/>
+          <w:bCs w:val="1"/>
+          <w:color w:val="1f4e79"/>
+        </w:rPr>
+      </w:pPr>
+      <w:r>
+        <w:rPr>
+          <w:rtl w:val="0"/>
+        </w:rPr>
+      </w:r>
+    </w:p>
+    <w:p>
+      <w:pPr>
+        <w:pStyle w:val="Heading2"/>
+        <w:spacing w:after="150" w:before="300" w:lineRule="auto"/>
+        <w:rPr>
+          <w:b w:val="1"/>
+          <w:bCs w:val="1"/>
+          <w:color w:val="1f4e79"/>
+        </w:rPr>
+      </w:pPr>
+      <w:r>
+        <w:rPr>
+          <w:rtl w:val="0"/>
+        </w:rPr>
+      </w:r>
+    </w:p>
+    <w:p>
+      <w:pPr>
+        <w:pStyle w:val="Heading2"/>
+        <w:spacing w:after="150" w:before="300" w:lineRule="auto"/>
+        <w:rPr>
+          <w:b w:val="1"/>
+          <w:bCs w:val="1"/>
+          <w:color w:val="1f4e79"/>
+        </w:rPr>
+      </w:pPr>
+      <w:r>
+        <w:rPr>
+          <w:rtl w:val="0"/>
+        </w:rPr>
+      </w:r>
+    </w:p>
+    <w:p>
+      <w:pPr>
+        <w:pStyle w:val="Heading2"/>
+        <w:spacing w:after="150" w:before="300" w:lineRule="auto"/>
+        <w:rPr>
+          <w:b w:val="1"/>
+          <w:bCs w:val="1"/>
+          <w:color w:val="1f4e79"/>
+        </w:rPr>
+      </w:pPr>
+      <w:r>
+        <w:rPr>
+          <w:rtl w:val="0"/>
+        </w:rPr>
+      </w:r>
+    </w:p>
+    <w:p>
+      <w:pPr>
+        <w:pStyle w:val="Heading2"/>
+        <w:spacing w:after="150" w:before="300" w:lineRule="auto"/>
+        <w:rPr>
+          <w:b w:val="1"/>
+          <w:bCs w:val="1"/>
+          <w:color w:val="1f4e79"/>
+        </w:rPr>
+      </w:pPr>
+      <w:r>
+        <w:rPr>
+          <w:rtl w:val="0"/>
+        </w:rPr>
+      </w:r>
+    </w:p>
+    <w:p>
+      <w:pPr>
+        <w:pStyle w:val="Heading2"/>
+        <w:spacing w:after="150" w:before="300" w:lineRule="auto"/>
+        <w:rPr>
+          <w:b w:val="1"/>
+          <w:bCs w:val="1"/>
+          <w:color w:val="1f4e79"/>
+        </w:rPr>
+      </w:pPr>
+      <w:r>
+        <w:rPr>
+          <w:rtl w:val="0"/>
+        </w:rPr>
+      </w:r>
+    </w:p>
+    <w:p>
+      <w:pPr>
+        <w:pStyle w:val="Heading2"/>
+        <w:spacing w:after="150" w:before="300" w:lineRule="auto"/>
         <w:rPr/>
       </w:pPr>
       <w:r>
@@ -857,16 +1155,16 @@
           <wp:inline distB="114300" distT="114300" distL="114300" distR="114300">
             <wp:extent cx="5943600" cy="2946400"/>
             <wp:effectExtent b="0" l="0" r="0" t="0"/>
-            <wp:docPr id="3" name="image8.png"/>
+            <wp:docPr id="3" name="image13.png"/>
             <a:graphic>
               <a:graphicData uri="http://schemas.openxmlformats.org/drawingml/2006/picture">
                 <pic:pic>
                   <pic:nvPicPr>
-                    <pic:cNvPr id="0" name="image8.png"/>
+                    <pic:cNvPr id="0" name="image13.png"/>
                     <pic:cNvPicPr preferRelativeResize="0"/>
                   </pic:nvPicPr>
                   <pic:blipFill>
-                    <a:blip r:embed="rId12"/>
+                    <a:blip r:embed="rId13"/>
                     <a:srcRect b="0" l="0" r="0" t="0"/>
                     <a:stretch>
                       <a:fillRect/>
@@ -896,6 +1194,182 @@
       <w:pPr>
         <w:pStyle w:val="Heading2"/>
         <w:spacing w:after="150" w:before="300" w:lineRule="auto"/>
+        <w:rPr>
+          <w:b w:val="1"/>
+          <w:bCs w:val="1"/>
+          <w:color w:val="1f4e79"/>
+        </w:rPr>
+      </w:pPr>
+      <w:r>
+        <w:rPr>
+          <w:rtl w:val="0"/>
+        </w:rPr>
+      </w:r>
+    </w:p>
+    <w:p>
+      <w:pPr>
+        <w:pStyle w:val="Heading2"/>
+        <w:spacing w:after="150" w:before="300" w:lineRule="auto"/>
+        <w:rPr>
+          <w:b w:val="1"/>
+          <w:bCs w:val="1"/>
+          <w:color w:val="1f4e79"/>
+        </w:rPr>
+      </w:pPr>
+      <w:r>
+        <w:rPr>
+          <w:rtl w:val="0"/>
+        </w:rPr>
+      </w:r>
+    </w:p>
+    <w:p>
+      <w:pPr>
+        <w:pStyle w:val="Heading2"/>
+        <w:spacing w:after="150" w:before="300" w:lineRule="auto"/>
+        <w:rPr>
+          <w:b w:val="1"/>
+          <w:bCs w:val="1"/>
+          <w:color w:val="1f4e79"/>
+        </w:rPr>
+      </w:pPr>
+      <w:r>
+        <w:rPr>
+          <w:rtl w:val="0"/>
+        </w:rPr>
+      </w:r>
+    </w:p>
+    <w:p>
+      <w:pPr>
+        <w:pStyle w:val="Heading2"/>
+        <w:spacing w:after="150" w:before="300" w:lineRule="auto"/>
+        <w:rPr>
+          <w:b w:val="1"/>
+          <w:bCs w:val="1"/>
+          <w:color w:val="1f4e79"/>
+        </w:rPr>
+      </w:pPr>
+      <w:r>
+        <w:rPr>
+          <w:rtl w:val="0"/>
+        </w:rPr>
+      </w:r>
+    </w:p>
+    <w:p>
+      <w:pPr>
+        <w:pStyle w:val="Heading2"/>
+        <w:spacing w:after="150" w:before="300" w:lineRule="auto"/>
+        <w:rPr>
+          <w:b w:val="1"/>
+          <w:bCs w:val="1"/>
+          <w:color w:val="1f4e79"/>
+        </w:rPr>
+      </w:pPr>
+      <w:r>
+        <w:rPr>
+          <w:rtl w:val="0"/>
+        </w:rPr>
+      </w:r>
+    </w:p>
+    <w:p>
+      <w:pPr>
+        <w:pStyle w:val="Heading2"/>
+        <w:spacing w:after="150" w:before="300" w:lineRule="auto"/>
+        <w:rPr>
+          <w:b w:val="1"/>
+          <w:bCs w:val="1"/>
+          <w:color w:val="1f4e79"/>
+        </w:rPr>
+      </w:pPr>
+      <w:r>
+        <w:rPr>
+          <w:rtl w:val="0"/>
+        </w:rPr>
+      </w:r>
+    </w:p>
+    <w:p>
+      <w:pPr>
+        <w:pStyle w:val="Heading2"/>
+        <w:spacing w:after="150" w:before="300" w:lineRule="auto"/>
+        <w:rPr>
+          <w:b w:val="1"/>
+          <w:bCs w:val="1"/>
+          <w:color w:val="1f4e79"/>
+        </w:rPr>
+      </w:pPr>
+      <w:r>
+        <w:rPr>
+          <w:rtl w:val="0"/>
+        </w:rPr>
+      </w:r>
+    </w:p>
+    <w:p>
+      <w:pPr>
+        <w:pStyle w:val="Heading2"/>
+        <w:spacing w:after="150" w:before="300" w:lineRule="auto"/>
+        <w:rPr>
+          <w:b w:val="1"/>
+          <w:bCs w:val="1"/>
+          <w:color w:val="1f4e79"/>
+        </w:rPr>
+      </w:pPr>
+      <w:r>
+        <w:rPr>
+          <w:rtl w:val="0"/>
+        </w:rPr>
+      </w:r>
+    </w:p>
+    <w:p>
+      <w:pPr>
+        <w:pStyle w:val="Heading2"/>
+        <w:spacing w:after="150" w:before="300" w:lineRule="auto"/>
+        <w:rPr>
+          <w:b w:val="1"/>
+          <w:bCs w:val="1"/>
+          <w:color w:val="1f4e79"/>
+        </w:rPr>
+      </w:pPr>
+      <w:r>
+        <w:rPr>
+          <w:rtl w:val="0"/>
+        </w:rPr>
+      </w:r>
+    </w:p>
+    <w:p>
+      <w:pPr>
+        <w:pStyle w:val="Heading2"/>
+        <w:spacing w:after="150" w:before="300" w:lineRule="auto"/>
+        <w:rPr>
+          <w:b w:val="1"/>
+          <w:bCs w:val="1"/>
+          <w:color w:val="1f4e79"/>
+        </w:rPr>
+      </w:pPr>
+      <w:r>
+        <w:rPr>
+          <w:rtl w:val="0"/>
+        </w:rPr>
+      </w:r>
+    </w:p>
+    <w:p>
+      <w:pPr>
+        <w:pStyle w:val="Heading2"/>
+        <w:spacing w:after="150" w:before="300" w:lineRule="auto"/>
+        <w:rPr>
+          <w:b w:val="1"/>
+          <w:bCs w:val="1"/>
+          <w:color w:val="1f4e79"/>
+        </w:rPr>
+      </w:pPr>
+      <w:r>
+        <w:rPr>
+          <w:rtl w:val="0"/>
+        </w:rPr>
+      </w:r>
+    </w:p>
+    <w:p>
+      <w:pPr>
+        <w:pStyle w:val="Heading2"/>
+        <w:spacing w:after="150" w:before="300" w:lineRule="auto"/>
         <w:rPr/>
       </w:pPr>
       <w:r>
@@ -936,16 +1410,16 @@
           <wp:inline distB="114300" distT="114300" distL="114300" distR="114300">
             <wp:extent cx="4819650" cy="4810125"/>
             <wp:effectExtent b="0" l="0" r="0" t="0"/>
-            <wp:docPr id="4" name="image12.png"/>
+            <wp:docPr id="4" name="image2.png"/>
             <a:graphic>
               <a:graphicData uri="http://schemas.openxmlformats.org/drawingml/2006/picture">
                 <pic:pic>
                   <pic:nvPicPr>
-                    <pic:cNvPr id="0" name="image12.png"/>
+                    <pic:cNvPr id="0" name="image2.png"/>
                     <pic:cNvPicPr preferRelativeResize="0"/>
                   </pic:nvPicPr>
                   <pic:blipFill>
-                    <a:blip r:embed="rId13"/>
+                    <a:blip r:embed="rId14"/>
                     <a:srcRect b="0" l="0" r="0" t="0"/>
                     <a:stretch>
                       <a:fillRect/>
@@ -975,6 +1449,102 @@
       <w:pPr>
         <w:pStyle w:val="Heading2"/>
         <w:spacing w:after="150" w:before="300" w:lineRule="auto"/>
+        <w:rPr>
+          <w:b w:val="1"/>
+          <w:bCs w:val="1"/>
+          <w:color w:val="1f4e79"/>
+        </w:rPr>
+      </w:pPr>
+      <w:r>
+        <w:rPr>
+          <w:rtl w:val="0"/>
+        </w:rPr>
+      </w:r>
+    </w:p>
+    <w:p>
+      <w:pPr>
+        <w:pStyle w:val="Heading2"/>
+        <w:spacing w:after="150" w:before="300" w:lineRule="auto"/>
+        <w:rPr>
+          <w:b w:val="1"/>
+          <w:bCs w:val="1"/>
+          <w:color w:val="1f4e79"/>
+        </w:rPr>
+      </w:pPr>
+      <w:r>
+        <w:rPr>
+          <w:rtl w:val="0"/>
+        </w:rPr>
+      </w:r>
+    </w:p>
+    <w:p>
+      <w:pPr>
+        <w:pStyle w:val="Heading2"/>
+        <w:spacing w:after="150" w:before="300" w:lineRule="auto"/>
+        <w:rPr>
+          <w:b w:val="1"/>
+          <w:bCs w:val="1"/>
+          <w:color w:val="1f4e79"/>
+        </w:rPr>
+      </w:pPr>
+      <w:r>
+        <w:rPr>
+          <w:rtl w:val="0"/>
+        </w:rPr>
+      </w:r>
+    </w:p>
+    <w:p>
+      <w:pPr>
+        <w:pStyle w:val="Heading2"/>
+        <w:spacing w:after="150" w:before="300" w:lineRule="auto"/>
+        <w:rPr>
+          <w:b w:val="1"/>
+          <w:bCs w:val="1"/>
+          <w:color w:val="1f4e79"/>
+        </w:rPr>
+      </w:pPr>
+      <w:r>
+        <w:rPr>
+          <w:rtl w:val="0"/>
+        </w:rPr>
+      </w:r>
+    </w:p>
+    <w:p>
+      <w:pPr>
+        <w:pStyle w:val="Heading2"/>
+        <w:spacing w:after="150" w:before="300" w:lineRule="auto"/>
+        <w:rPr>
+          <w:b w:val="1"/>
+          <w:bCs w:val="1"/>
+          <w:color w:val="1f4e79"/>
+        </w:rPr>
+      </w:pPr>
+      <w:r>
+        <w:rPr>
+          <w:rtl w:val="0"/>
+        </w:rPr>
+      </w:r>
+    </w:p>
+    <w:p>
+      <w:pPr>
+        <w:pStyle w:val="Heading2"/>
+        <w:spacing w:after="150" w:before="300" w:lineRule="auto"/>
+        <w:rPr>
+          <w:b w:val="1"/>
+          <w:bCs w:val="1"/>
+          <w:color w:val="1f4e79"/>
+        </w:rPr>
+      </w:pPr>
+      <w:r>
+        <w:rPr>
+          <w:rtl w:val="0"/>
+        </w:rPr>
+      </w:r>
+    </w:p>
+    <w:p>
+      <w:pPr>
+        <w:pStyle w:val="Heading2"/>
+        <w:spacing w:after="150" w:before="300" w:lineRule="auto"/>
         <w:rPr/>
       </w:pPr>
       <w:r>
@@ -1015,16 +1585,16 @@
           <wp:inline distB="114300" distT="114300" distL="114300" distR="114300">
             <wp:extent cx="5076825" cy="3552825"/>
             <wp:effectExtent b="0" l="0" r="0" t="0"/>
-            <wp:docPr id="9" name="image5.png"/>
+            <wp:docPr id="9" name="image7.png"/>
             <a:graphic>
               <a:graphicData uri="http://schemas.openxmlformats.org/drawingml/2006/picture">
                 <pic:pic>
                   <pic:nvPicPr>
-                    <pic:cNvPr id="0" name="image5.png"/>
+                    <pic:cNvPr id="0" name="image7.png"/>
                     <pic:cNvPicPr preferRelativeResize="0"/>
                   </pic:nvPicPr>
                   <pic:blipFill>
-                    <a:blip r:embed="rId14"/>
+                    <a:blip r:embed="rId15"/>
                     <a:srcRect b="0" l="0" r="0" t="0"/>
                     <a:stretch>
                       <a:fillRect/>
@@ -1072,16 +1642,16 @@
           <wp:inline distB="114300" distT="114300" distL="114300" distR="114300">
             <wp:extent cx="5943600" cy="4978400"/>
             <wp:effectExtent b="0" l="0" r="0" t="0"/>
-            <wp:docPr id="6" name="image11.png"/>
+            <wp:docPr id="6" name="image8.png"/>
             <a:graphic>
               <a:graphicData uri="http://schemas.openxmlformats.org/drawingml/2006/picture">
                 <pic:pic>
                   <pic:nvPicPr>
-                    <pic:cNvPr id="0" name="image11.png"/>
+                    <pic:cNvPr id="0" name="image8.png"/>
                     <pic:cNvPicPr preferRelativeResize="0"/>
                   </pic:nvPicPr>
                   <pic:blipFill>
-                    <a:blip r:embed="rId15"/>
+                    <a:blip r:embed="rId16"/>
                     <a:srcRect b="0" l="0" r="0" t="0"/>
                     <a:stretch>
                       <a:fillRect/>
@@ -1111,6 +1681,70 @@
       <w:pPr>
         <w:pStyle w:val="Heading1"/>
         <w:spacing w:after="200" w:before="400" w:lineRule="auto"/>
+        <w:rPr>
+          <w:b w:val="1"/>
+          <w:bCs w:val="1"/>
+          <w:color w:val="1f4e79"/>
+        </w:rPr>
+      </w:pPr>
+      <w:r>
+        <w:rPr>
+          <w:rtl w:val="0"/>
+        </w:rPr>
+      </w:r>
+    </w:p>
+    <w:p>
+      <w:pPr>
+        <w:pStyle w:val="Heading1"/>
+        <w:spacing w:after="200" w:before="400" w:lineRule="auto"/>
+        <w:rPr>
+          <w:b w:val="1"/>
+          <w:bCs w:val="1"/>
+          <w:color w:val="1f4e79"/>
+        </w:rPr>
+      </w:pPr>
+      <w:r>
+        <w:rPr>
+          <w:rtl w:val="0"/>
+        </w:rPr>
+      </w:r>
+    </w:p>
+    <w:p>
+      <w:pPr>
+        <w:pStyle w:val="Heading1"/>
+        <w:spacing w:after="200" w:before="400" w:lineRule="auto"/>
+        <w:rPr>
+          <w:b w:val="1"/>
+          <w:bCs w:val="1"/>
+          <w:color w:val="1f4e79"/>
+        </w:rPr>
+      </w:pPr>
+      <w:r>
+        <w:rPr>
+          <w:rtl w:val="0"/>
+        </w:rPr>
+      </w:r>
+    </w:p>
+    <w:p>
+      <w:pPr>
+        <w:pStyle w:val="Heading1"/>
+        <w:spacing w:after="200" w:before="400" w:lineRule="auto"/>
+        <w:rPr>
+          <w:b w:val="1"/>
+          <w:bCs w:val="1"/>
+          <w:color w:val="1f4e79"/>
+        </w:rPr>
+      </w:pPr>
+      <w:r>
+        <w:rPr>
+          <w:rtl w:val="0"/>
+        </w:rPr>
+      </w:r>
+    </w:p>
+    <w:p>
+      <w:pPr>
+        <w:pStyle w:val="Heading1"/>
+        <w:spacing w:after="200" w:before="400" w:lineRule="auto"/>
         <w:rPr/>
       </w:pPr>
       <w:r>
@@ -1151,16 +1785,16 @@
           <wp:inline distB="114300" distT="114300" distL="114300" distR="114300">
             <wp:extent cx="5943600" cy="3924300"/>
             <wp:effectExtent b="0" l="0" r="0" t="0"/>
-            <wp:docPr id="7" name="image10.png"/>
+            <wp:docPr id="7" name="image11.png"/>
             <a:graphic>
               <a:graphicData uri="http://schemas.openxmlformats.org/drawingml/2006/picture">
                 <pic:pic>
                   <pic:nvPicPr>
-                    <pic:cNvPr id="0" name="image10.png"/>
+                    <pic:cNvPr id="0" name="image11.png"/>
                     <pic:cNvPicPr preferRelativeResize="0"/>
                   </pic:nvPicPr>
                   <pic:blipFill>
-                    <a:blip r:embed="rId16"/>
+                    <a:blip r:embed="rId17"/>
                     <a:srcRect b="0" l="0" r="0" t="0"/>
                     <a:stretch>
                       <a:fillRect/>
@@ -1197,16 +1831,16 @@
           <wp:inline distB="114300" distT="114300" distL="114300" distR="114300">
             <wp:extent cx="5943600" cy="5194300"/>
             <wp:effectExtent b="0" l="0" r="0" t="0"/>
-            <wp:docPr id="5" name="image9.png"/>
+            <wp:docPr id="5" name="image1.png"/>
             <a:graphic>
               <a:graphicData uri="http://schemas.openxmlformats.org/drawingml/2006/picture">
                 <pic:pic>
                   <pic:nvPicPr>
-                    <pic:cNvPr id="0" name="image9.png"/>
+                    <pic:cNvPr id="0" name="image1.png"/>
                     <pic:cNvPicPr preferRelativeResize="0"/>
                   </pic:nvPicPr>
                   <pic:blipFill>
-                    <a:blip r:embed="rId17"/>
+                    <a:blip r:embed="rId18"/>
                     <a:srcRect b="0" l="0" r="0" t="0"/>
                     <a:stretch>
                       <a:fillRect/>
@@ -1255,16 +1889,16 @@
           <wp:inline distB="114300" distT="114300" distL="114300" distR="114300">
             <wp:extent cx="5943600" cy="1663700"/>
             <wp:effectExtent b="0" l="0" r="0" t="0"/>
-            <wp:docPr id="2" name="image7.png"/>
+            <wp:docPr id="2" name="image6.png"/>
             <a:graphic>
               <a:graphicData uri="http://schemas.openxmlformats.org/drawingml/2006/picture">
                 <pic:pic>
                   <pic:nvPicPr>
-                    <pic:cNvPr id="0" name="image7.png"/>
+                    <pic:cNvPr id="0" name="image6.png"/>
                     <pic:cNvPicPr preferRelativeResize="0"/>
                   </pic:nvPicPr>
                   <pic:blipFill>
-                    <a:blip r:embed="rId18"/>
+                    <a:blip r:embed="rId19"/>
                     <a:srcRect b="0" l="0" r="0" t="0"/>
                     <a:stretch>
                       <a:fillRect/>
@@ -1293,6 +1927,48 @@
     <w:p>
       <w:pPr>
         <w:spacing w:after="100" w:before="200" w:lineRule="auto"/>
+        <w:rPr>
+          <w:b w:val="1"/>
+          <w:bCs w:val="1"/>
+        </w:rPr>
+      </w:pPr>
+      <w:r>
+        <w:rPr>
+          <w:rtl w:val="0"/>
+        </w:rPr>
+      </w:r>
+    </w:p>
+    <w:p>
+      <w:pPr>
+        <w:spacing w:after="100" w:before="200" w:lineRule="auto"/>
+        <w:rPr>
+          <w:b w:val="1"/>
+          <w:bCs w:val="1"/>
+        </w:rPr>
+      </w:pPr>
+      <w:r>
+        <w:rPr>
+          <w:rtl w:val="0"/>
+        </w:rPr>
+      </w:r>
+    </w:p>
+    <w:p>
+      <w:pPr>
+        <w:spacing w:after="100" w:before="200" w:lineRule="auto"/>
+        <w:rPr>
+          <w:b w:val="1"/>
+          <w:bCs w:val="1"/>
+        </w:rPr>
+      </w:pPr>
+      <w:r>
+        <w:rPr>
+          <w:rtl w:val="0"/>
+        </w:rPr>
+      </w:r>
+    </w:p>
+    <w:p>
+      <w:pPr>
+        <w:spacing w:after="100" w:before="200" w:lineRule="auto"/>
         <w:rPr/>
       </w:pPr>
       <w:r>
@@ -1322,8 +1998,8 @@
       </w:r>
     </w:p>
     <w:sectPr>
-      <w:headerReference r:id="rId19" w:type="default"/>
-      <w:footerReference r:id="rId20" w:type="default"/>
+      <w:headerReference r:id="rId20" w:type="default"/>
+      <w:footerReference r:id="rId21" w:type="default"/>
       <w:type w:val="nextPage"/>
       <w:pgSz w:h="15840" w:w="12240" w:orient="portrait"/>
       <w:pgMar w:bottom="1440" w:top="1440" w:left="1440" w:right="1440" w:header="708" w:footer="708"/>

</xml_diff>